<commit_message>
Informe con enlace al repositorio
</commit_message>
<xml_diff>
--- a/informe/Laboratorio 6 - Informe.docx
+++ b/informe/Laboratorio 6 - Informe.docx
@@ -57,7 +57,7 @@
           <w:sz w:val="19"/>
           <w:szCs w:val="19"/>
         </w:rPr>
-        <w:t xml:space="preserve">Repositorio: (repositorio pendiente de publicar)</w:t>
+        <w:t xml:space="preserve">Repositorio: https://github.com/SantiagoJacome14/-lab-6-iot</w:t>
       </w:r>
     </w:p>
     <w:p>
@@ -799,7 +799,7 @@
           <w:sz w:val="20"/>
           <w:szCs w:val="20"/>
         </w:rPr>
-        <w:t xml:space="preserve">Repositorio (repositorio pendiente de publicar): infra/ y azure.yaml (AKS + ACR), k8s/wordpress, k8s/prestashop y k8s/monitoring (manifiestos y Secrets de ejemplo sin valores reales), scripts/desplegar.ps1, README con el despliegue completo y evidencias/ (los dos sitios, reinicios, clúster y Grafana). Las evidencias se adjuntan al final como Anexo.</w:t>
+        <w:t xml:space="preserve">Repositorio https://github.com/SantiagoJacome14/-lab-6-iot: infra/ y azure.yaml (AKS + ACR), k8s/wordpress, k8s/prestashop y k8s/monitoring (manifiestos y Secrets de ejemplo sin valores reales), scripts/desplegar.ps1, README con el despliegue completo y evidencias/ (los dos sitios, reinicios, clúster y Grafana). Las evidencias se adjuntan al final como Anexo.</w:t>
       </w:r>
     </w:p>
     <w:p>

</xml_diff>

<commit_message>
Lab 6: capturas posteriores al reinicio, sustentacion y estado final
</commit_message>
<xml_diff>
--- a/informe/Laboratorio 6 - Informe.docx
+++ b/informe/Laboratorio 6 - Informe.docx
@@ -667,7 +667,7 @@
                 <w:sz w:val="18"/>
                 <w:szCs w:val="18"/>
               </w:rPr>
-              <w:t xml:space="preserve">Creado el 29-oct-2026 hacia las 03:15 UTC. La fecha de apagado se anota en el README tras ejecutar azd down.</w:t>
+              <w:t xml:space="preserve">Creado el 29-oct-2026 hacia las 03:15 UTC y apagado con azd down --force --purge a las 06:10 UTC del mismo día (unas 3 horas encendido). Tras el apagado el grupo rg-lab6 deja de existir.</w:t>
             </w:r>
           </w:p>
         </w:tc>
@@ -970,7 +970,7 @@
       <w:r>
         <w:drawing>
           <wp:inline distT="0" distB="0" distL="0" distR="0">
-            <wp:extent cx="5848350" cy="2962275"/>
+            <wp:extent cx="4629150" cy="2381250"/>
             <wp:effectExtent t="0" r="0" b="0" l="0"/>
             <wp:docPr id="1" name="" descr="" title=""/>
             <wp:cNvGraphicFramePr>
@@ -995,6 +995,195 @@
                   <pic:spPr bwMode="auto">
                     <a:xfrm>
                       <a:off x="0" y="0"/>
+                      <a:ext cx="4629150" cy="2381250"/>
+                    </a:xfrm>
+                    <a:prstGeom prst="rect">
+                      <a:avLst/>
+                    </a:prstGeom>
+                  </pic:spPr>
+                </pic:pic>
+              </a:graphicData>
+            </a:graphic>
+          </wp:inline>
+        </w:drawing>
+      </w:r>
+    </w:p>
+    <w:p>
+      <w:pPr>
+        <w:spacing w:after="140"/>
+        <w:jc w:val="center"/>
+      </w:pPr>
+      <w:r>
+        <w:rPr>
+          <w:i/>
+          <w:iCs/>
+          <w:color w:val="475569"/>
+          <w:sz w:val="17"/>
+          <w:szCs w:val="17"/>
+        </w:rPr>
+        <w:t xml:space="preserve">Evidencia 03. WordPress después del reinicio del pod: la misma página sigue publicada (mismo contenido, misma IP).</w:t>
+      </w:r>
+    </w:p>
+    <w:p>
+      <w:pPr>
+        <w:keepNext/>
+        <w:spacing w:after="40" w:before="120"/>
+        <w:jc w:val="center"/>
+      </w:pPr>
+      <w:r>
+        <w:drawing>
+          <wp:inline distT="0" distB="0" distL="0" distR="0">
+            <wp:extent cx="5848350" cy="1828800"/>
+            <wp:effectExtent t="0" r="0" b="0" l="0"/>
+            <wp:docPr id="1" name="" descr="" title=""/>
+            <wp:cNvGraphicFramePr>
+              <a:graphicFrameLocks xmlns:a="http://schemas.openxmlformats.org/drawingml/2006/main" noChangeAspect="1"/>
+            </wp:cNvGraphicFramePr>
+            <a:graphic xmlns:a="http://schemas.openxmlformats.org/drawingml/2006/main">
+              <a:graphicData uri="http://schemas.openxmlformats.org/drawingml/2006/picture">
+                <pic:pic xmlns:pic="http://schemas.openxmlformats.org/drawingml/2006/picture">
+                  <pic:nvPicPr>
+                    <pic:cNvPr id="0" name="" descr=""/>
+                    <pic:cNvPicPr>
+                      <a:picLocks noChangeAspect="1" noChangeArrowheads="1"/>
+                    </pic:cNvPicPr>
+                  </pic:nvPicPr>
+                  <pic:blipFill>
+                    <a:blip r:embed="rId11" cstate="none"/>
+                    <a:srcRect/>
+                    <a:stretch>
+                      <a:fillRect/>
+                    </a:stretch>
+                  </pic:blipFill>
+                  <pic:spPr bwMode="auto">
+                    <a:xfrm>
+                      <a:off x="0" y="0"/>
+                      <a:ext cx="5848350" cy="1828800"/>
+                    </a:xfrm>
+                    <a:prstGeom prst="rect">
+                      <a:avLst/>
+                    </a:prstGeom>
+                  </pic:spPr>
+                </pic:pic>
+              </a:graphicData>
+            </a:graphic>
+          </wp:inline>
+        </w:drawing>
+      </w:r>
+    </w:p>
+    <w:p>
+      <w:pPr>
+        <w:spacing w:after="140"/>
+        <w:jc w:val="center"/>
+      </w:pPr>
+      <w:r>
+        <w:rPr>
+          <w:i/>
+          <w:iCs/>
+          <w:color w:val="475569"/>
+          <w:sz w:val="17"/>
+          <w:szCs w:val="17"/>
+        </w:rPr>
+        <w:t xml:space="preserve">Evidencia 04. PrestaShop después del reinicio: Producto Lab 6 (ID 20, 25.000,00 €, activo) sigue en el catálogo.</w:t>
+      </w:r>
+    </w:p>
+    <w:p>
+      <w:pPr>
+        <w:keepNext/>
+        <w:spacing w:after="40" w:before="120"/>
+        <w:jc w:val="center"/>
+      </w:pPr>
+      <w:r>
+        <w:drawing>
+          <wp:inline distT="0" distB="0" distL="0" distR="0">
+            <wp:extent cx="5410200" cy="2743200"/>
+            <wp:effectExtent t="0" r="0" b="0" l="0"/>
+            <wp:docPr id="1" name="" descr="" title=""/>
+            <wp:cNvGraphicFramePr>
+              <a:graphicFrameLocks xmlns:a="http://schemas.openxmlformats.org/drawingml/2006/main" noChangeAspect="1"/>
+            </wp:cNvGraphicFramePr>
+            <a:graphic xmlns:a="http://schemas.openxmlformats.org/drawingml/2006/main">
+              <a:graphicData uri="http://schemas.openxmlformats.org/drawingml/2006/picture">
+                <pic:pic xmlns:pic="http://schemas.openxmlformats.org/drawingml/2006/picture">
+                  <pic:nvPicPr>
+                    <pic:cNvPr id="0" name="" descr=""/>
+                    <pic:cNvPicPr>
+                      <a:picLocks noChangeAspect="1" noChangeArrowheads="1"/>
+                    </pic:cNvPicPr>
+                  </pic:nvPicPr>
+                  <pic:blipFill>
+                    <a:blip r:embed="rId12" cstate="none"/>
+                    <a:srcRect/>
+                    <a:stretch>
+                      <a:fillRect/>
+                    </a:stretch>
+                  </pic:blipFill>
+                  <pic:spPr bwMode="auto">
+                    <a:xfrm>
+                      <a:off x="0" y="0"/>
+                      <a:ext cx="5410200" cy="2743200"/>
+                    </a:xfrm>
+                    <a:prstGeom prst="rect">
+                      <a:avLst/>
+                    </a:prstGeom>
+                  </pic:spPr>
+                </pic:pic>
+              </a:graphicData>
+            </a:graphic>
+          </wp:inline>
+        </w:drawing>
+      </w:r>
+    </w:p>
+    <w:p>
+      <w:pPr>
+        <w:spacing w:after="140"/>
+        <w:jc w:val="center"/>
+      </w:pPr>
+      <w:r>
+        <w:rPr>
+          <w:i/>
+          <w:iCs/>
+          <w:color w:val="475569"/>
+          <w:sz w:val="17"/>
+          <w:szCs w:val="17"/>
+        </w:rPr>
+        <w:t xml:space="preserve">Evidencia 05. PrestaShop después del reinicio: página pública del producto (68.211.132.86) con su nombre y precio; sin stock porque se creó con cantidad 0.</w:t>
+      </w:r>
+    </w:p>
+    <w:p>
+      <w:pPr>
+        <w:keepNext/>
+        <w:spacing w:after="40" w:before="120"/>
+        <w:jc w:val="center"/>
+      </w:pPr>
+      <w:r>
+        <w:drawing>
+          <wp:inline distT="0" distB="0" distL="0" distR="0">
+            <wp:extent cx="5848350" cy="2962275"/>
+            <wp:effectExtent t="0" r="0" b="0" l="0"/>
+            <wp:docPr id="1" name="" descr="" title=""/>
+            <wp:cNvGraphicFramePr>
+              <a:graphicFrameLocks xmlns:a="http://schemas.openxmlformats.org/drawingml/2006/main" noChangeAspect="1"/>
+            </wp:cNvGraphicFramePr>
+            <a:graphic xmlns:a="http://schemas.openxmlformats.org/drawingml/2006/main">
+              <a:graphicData uri="http://schemas.openxmlformats.org/drawingml/2006/picture">
+                <pic:pic xmlns:pic="http://schemas.openxmlformats.org/drawingml/2006/picture">
+                  <pic:nvPicPr>
+                    <pic:cNvPr id="0" name="" descr=""/>
+                    <pic:cNvPicPr>
+                      <a:picLocks noChangeAspect="1" noChangeArrowheads="1"/>
+                    </pic:cNvPicPr>
+                  </pic:nvPicPr>
+                  <pic:blipFill>
+                    <a:blip r:embed="rId13" cstate="none"/>
+                    <a:srcRect/>
+                    <a:stretch>
+                      <a:fillRect/>
+                    </a:stretch>
+                  </pic:blipFill>
+                  <pic:spPr bwMode="auto">
+                    <a:xfrm>
+                      <a:off x="0" y="0"/>
                       <a:ext cx="5848350" cy="2962275"/>
                     </a:xfrm>
                     <a:prstGeom prst="rect">
@@ -1021,7 +1210,7 @@
           <w:sz w:val="17"/>
           <w:szCs w:val="17"/>
         </w:rPr>
-        <w:t xml:space="preserve">Evidencia 03. Grafana: pods Running de WordPress y PrestaShop, reinicios, CPU y memoria por pod; se distinguen los pods viejos y nuevos tras el reinicio.</w:t>
+        <w:t xml:space="preserve">Evidencia 06. Grafana: pods Running de WordPress y PrestaShop, reinicios, CPU y memoria por pod; se distinguen los pods viejos y nuevos tras el reinicio.</w:t>
       </w:r>
     </w:p>
     <w:p>
@@ -1036,7 +1225,7 @@
           <w:sz w:val="18"/>
           <w:szCs w:val="18"/>
         </w:rPr>
-        <w:t xml:space="preserve">Evidencia 04. 03_reinicios.txt (reinicio de los dos Deployments y verificación)</w:t>
+        <w:t xml:space="preserve">Evidencia 07. 03_reinicios.txt (reinicio de los dos Deployments y verificación)</w:t>
       </w:r>
     </w:p>
     <w:p>
@@ -1740,7 +1929,7 @@
           <w:sz w:val="18"/>
           <w:szCs w:val="18"/>
         </w:rPr>
-        <w:t xml:space="preserve">Evidencia 05. 00_cluster.txt (clúster, pods, PVC y servicios)</w:t>
+        <w:t xml:space="preserve">Evidencia 08. 00_cluster.txt (clúster, pods, PVC y servicios)</w:t>
       </w:r>
     </w:p>
     <w:p>

</xml_diff>